<commit_message>
Actualiza plantillas: horarios corregidos y bordes en tablas
Co-Authored-By: Claude Sonnet 4.6 <noreply@anthropic.com>
</commit_message>
<xml_diff>
--- a/plantillas/Plantilla_0_Diagnostico.docx
+++ b/plantillas/Plantilla_0_Diagnostico.docx
@@ -66,7 +66,7 @@
         <w:pStyle w:val="BlockText"/>
       </w:pPr>
       <w:r>
-        <w:t xml:space="preserve">Esta plantilla es solo para ti. No se comparte en plenaria, pero sí la vas a usar en la sala de trabajo de 10:05 a 10:30. Sé honesto/a: el diagnóstico más útil es el más incómodo.</w:t>
+        <w:t xml:space="preserve">Esta plantilla es solo para ti. No se comparte en plenaria, pero sí la vas a usar en la diagnóstico inicial de 9:40 a 10:00. Sé honesto/a: el diagnóstico más útil es el más incómodo.</w:t>
       </w:r>
     </w:p>
     <w:p>
@@ -242,13 +242,13 @@
       </w:r>
     </w:p>
     <w:bookmarkEnd w:id="12"/>
-    <w:bookmarkStart w:id="13" w:name="notas-de-la-sala-de-trabajo-1005-1030"/>
+    <w:bookmarkStart w:id="13" w:name="notas-de-la-sala-de-trabajo-1055-1120"/>
     <w:p>
       <w:pPr>
         <w:pStyle w:val="Heading2"/>
       </w:pPr>
       <w:r>
-        <w:t xml:space="preserve">Notas de la sala de trabajo (10:05-10:30)</w:t>
+        <w:t xml:space="preserve">Notas de la sala de trabajo (10:55-11:20)</w:t>
       </w:r>
     </w:p>
     <w:p>

</xml_diff>